<commit_message>
Afegir funcionalitat per generar informes de faltes en format PDF i millorar la neteja de plantilles (botó provisional per la generació)
</commit_message>
<xml_diff>
--- a/back/laravel-api/templates-word/(Plantilla impersonal) Carta 30_60 faltes (majors d_edat).docx
+++ b/back/laravel-api/templates-word/(Plantilla impersonal) Carta 30_60 faltes (majors d_edat).docx
@@ -176,20 +176,12 @@
       <w:r>
         <w:rPr>
           <w:rFonts w:ascii="Arial" w:hAnsi="Arial" w:eastAsia="Arial" w:cs="Arial"/>
-          <w:sz w:val="26"/>
-          <w:szCs w:val="26"/>
-        </w:rPr>
-        <w:t>${</w:t>
-      </w:r>
-      <w:r>
-        <w:rPr>
-          <w:rFonts w:ascii="Arial" w:hAnsi="Arial" w:eastAsia="Arial" w:cs="Arial"/>
           <w:b w:val="1"/>
           <w:bCs w:val="1"/>
           <w:sz w:val="26"/>
           <w:szCs w:val="26"/>
         </w:rPr>
-        <w:t>#Hores</w:t>
+        <w:t>${</w:t>
       </w:r>
       <w:r>
         <w:rPr>
@@ -199,7 +191,7 @@
           <w:sz w:val="26"/>
           <w:szCs w:val="26"/>
         </w:rPr>
-        <w:t>}</w:t>
+        <w:t>#Hores</w:t>
       </w:r>
       <w:r>
         <w:rPr>
@@ -209,7 +201,27 @@
           <w:sz w:val="26"/>
           <w:szCs w:val="26"/>
         </w:rPr>
-        <w:t xml:space="preserve"> hores de faltes no justificades.</w:t>
+        <w:t>}</w:t>
+      </w:r>
+      <w:r>
+        <w:rPr>
+          <w:rFonts w:ascii="Arial" w:hAnsi="Arial" w:eastAsia="Arial" w:cs="Arial"/>
+          <w:b w:val="1"/>
+          <w:bCs w:val="1"/>
+          <w:sz w:val="26"/>
+          <w:szCs w:val="26"/>
+        </w:rPr>
+        <w:t xml:space="preserve"> hores de faltes no justificades</w:t>
+      </w:r>
+      <w:r>
+        <w:rPr>
+          <w:rFonts w:ascii="Arial" w:hAnsi="Arial" w:eastAsia="Arial" w:cs="Arial"/>
+          <w:b w:val="1"/>
+          <w:bCs w:val="1"/>
+          <w:sz w:val="26"/>
+          <w:szCs w:val="26"/>
+        </w:rPr>
+        <w:t>.</w:t>
       </w:r>
       <w:r>
         <w:rPr>
@@ -227,7 +239,7 @@
           <w:ilvl w:val="0"/>
           <w:numId w:val="1"/>
         </w:numPr>
-        <w:spacing w:before="240" w:after="0" w:afterAutospacing="0" w:lineRule="auto"/>
+        <w:spacing w:before="240" w:after="0" w:afterAutospacing="off" w:lineRule="auto"/>
         <w:ind w:left="720" w:hanging="360"/>
         <w:jc w:val="both"/>
         <w:rPr>
@@ -242,7 +254,6 @@
           <w:rFonts w:ascii="Arial" w:hAnsi="Arial" w:eastAsia="Arial" w:cs="Arial"/>
           <w:sz w:val="26"/>
           <w:szCs w:val="26"/>
-          <w:rtl w:val="0"/>
         </w:rPr>
         <w:t xml:space="preserve">aquest centre imparteix estudis en modalitat presencial basada en l’avaluació contínua, per la qual cosa </w:t>
       </w:r>
@@ -253,7 +264,6 @@
           <w:bCs w:val="1"/>
           <w:sz w:val="26"/>
           <w:szCs w:val="26"/>
-          <w:rtl w:val="0"/>
         </w:rPr>
         <w:t xml:space="preserve">l’assistència</w:t>
       </w:r>
@@ -262,7 +272,6 @@
           <w:rFonts w:ascii="Arial" w:hAnsi="Arial" w:eastAsia="Arial" w:cs="Arial"/>
           <w:sz w:val="26"/>
           <w:szCs w:val="26"/>
-          <w:rtl w:val="0"/>
         </w:rPr>
         <w:t xml:space="preserve"> a les activitats lectives (al centre o fora) és </w:t>
       </w:r>
@@ -273,20 +282,8 @@
           <w:bCs w:val="1"/>
           <w:sz w:val="26"/>
           <w:szCs w:val="26"/>
-          <w:rtl w:val="0"/>
         </w:rPr>
         <w:t xml:space="preserve">obligatòria i necessària.</w:t>
-      </w:r>
-      <w:r>
-        <w:rPr>
-          <w:rFonts w:ascii="Arial" w:hAnsi="Arial" w:eastAsia="Arial" w:cs="Arial"/>
-          <w:b w:val="1"/>
-          <w:bCs w:val="1"/>
-          <w:sz w:val="26"/>
-          <w:szCs w:val="26"/>
-          <w:rtl w:val="0"/>
-        </w:rPr>
-        <w:br w:type="textWrapping"/>
       </w:r>
     </w:p>
     <w:p xmlns:wp14="http://schemas.microsoft.com/office/word/2010/wordml" wp14:textId="77777777">
@@ -316,7 +313,7 @@
         <w:t xml:space="preserve">a partir de les 90 hores de faltes no justificades, l’institut pot procedir a la baixa d’ofici de la matrícula, d’acord amb el que estableix la Normativa d’Organització i Funcionament de Centre (NOFC).</w:t>
       </w:r>
     </w:p>
-    <w:p xmlns:wp14="http://schemas.microsoft.com/office/word/2010/wordml" wp14:textId="77777777">
+    <w:p xmlns:wp14="http://schemas.microsoft.com/office/word/2010/wordml" wp14:textId="3E60DDD4">
       <w:pPr>
         <w:widowControl w:val="1"/>
         <w:spacing w:before="240" w:after="240" w:lineRule="auto"/>
@@ -332,117 +329,183 @@
           <w:rFonts w:ascii="Arial" w:hAnsi="Arial" w:eastAsia="Arial" w:cs="Arial"/>
           <w:sz w:val="26"/>
           <w:szCs w:val="26"/>
+        </w:rPr>
+        <w:t>Atentament,</w:t>
+      </w:r>
+    </w:p>
+    <w:tbl>
+      <w:tblPr>
+        <w:tblStyle w:val="TableGrid"/>
+        <w:bidiVisual w:val="0"/>
+        <w:tblW w:w="0" w:type="auto"/>
+        <w:tblBorders>
+          <w:top w:val="single" w:sz="6"/>
+          <w:left w:val="single" w:sz="6"/>
+          <w:bottom w:val="single" w:sz="6"/>
+          <w:right w:val="single" w:sz="6"/>
+        </w:tblBorders>
+        <w:tblLook w:val="0000" w:firstRow="0" w:lastRow="0" w:firstColumn="0" w:lastColumn="0" w:noHBand="0" w:noVBand="0"/>
+      </w:tblPr>
+      <w:tblGrid>
+        <w:gridCol w:w="5115"/>
+      </w:tblGrid>
+      <w:tr>
+        <w:trPr>
+          <w:trHeight w:val="300"/>
+        </w:trPr>
+        <w:tc>
+          <w:tcPr>
+            <w:tcW w:w="5115" w:type="dxa"/>
+            <w:tcBorders>
+              <w:top w:val="nil"/>
+              <w:left w:val="nil"/>
+              <w:bottom w:val="nil"/>
+              <w:right w:val="nil"/>
+            </w:tcBorders>
+            <w:tcMar>
+              <w:left w:w="90" w:type="dxa"/>
+              <w:right w:w="90" w:type="dxa"/>
+            </w:tcMar>
+            <w:vAlign w:val="top"/>
+          </w:tcPr>
+          <w:p>
+            <w:pPr>
+              <w:rPr>
+                <w:rFonts w:ascii="Arial" w:hAnsi="Arial" w:eastAsia="Arial" w:cs="Arial"/>
+                <w:b w:val="0"/>
+                <w:bCs w:val="0"/>
+                <w:i w:val="0"/>
+                <w:iCs w:val="0"/>
+                <w:caps w:val="0"/>
+                <w:smallCaps w:val="0"/>
+                <w:color w:val="000000" w:themeColor="text1" w:themeTint="FF" w:themeShade="FF"/>
+                <w:sz w:val="26"/>
+                <w:szCs w:val="26"/>
+                <w:lang w:val="es-ES"/>
+              </w:rPr>
+            </w:pPr>
+            <w:r>
+              <w:rPr>
+                <w:rFonts w:ascii="Arial" w:hAnsi="Arial" w:eastAsia="Arial" w:cs="Arial"/>
+                <w:b w:val="0"/>
+                <w:bCs w:val="0"/>
+                <w:i w:val="0"/>
+                <w:iCs w:val="0"/>
+                <w:caps w:val="0"/>
+                <w:smallCaps w:val="0"/>
+                <w:color w:val="000000" w:themeColor="text1" w:themeTint="FF" w:themeShade="FF"/>
+                <w:sz w:val="26"/>
+                <w:szCs w:val="26"/>
+                <w:lang w:val="en-US"/>
+              </w:rPr>
+              <w:t>${Tutor}</w:t>
+            </w:r>
+          </w:p>
+        </w:tc>
+      </w:tr>
+      <w:tr>
+        <w:trPr>
+          <w:trHeight w:val="300"/>
+        </w:trPr>
+        <w:tc>
+          <w:tcPr>
+            <w:tcW w:w="5115" w:type="dxa"/>
+            <w:tcBorders>
+              <w:top w:val="nil"/>
+              <w:left w:val="nil"/>
+              <w:bottom w:val="nil"/>
+              <w:right w:val="nil"/>
+            </w:tcBorders>
+            <w:tcMar>
+              <w:left w:w="90" w:type="dxa"/>
+              <w:right w:w="90" w:type="dxa"/>
+            </w:tcMar>
+            <w:vAlign w:val="top"/>
+          </w:tcPr>
+          <w:p>
+            <w:pPr>
+              <w:widowControl w:val="1"/>
+              <w:spacing w:before="0" w:beforeAutospacing="off" w:after="0" w:afterAutospacing="off" w:line="259" w:lineRule="auto"/>
+              <w:ind w:left="0" w:right="0"/>
+              <w:jc w:val="left"/>
+              <w:rPr>
+                <w:rFonts w:ascii="Arial" w:hAnsi="Arial" w:eastAsia="Arial" w:cs="Arial"/>
+                <w:b w:val="0"/>
+                <w:bCs w:val="0"/>
+                <w:i w:val="0"/>
+                <w:iCs w:val="0"/>
+                <w:caps w:val="0"/>
+                <w:smallCaps w:val="0"/>
+                <w:color w:val="000000" w:themeColor="text1" w:themeTint="FF" w:themeShade="FF"/>
+                <w:sz w:val="26"/>
+                <w:szCs w:val="26"/>
+                <w:lang w:val="es-ES"/>
+              </w:rPr>
+            </w:pPr>
+            <w:r>
+              <w:rPr>
+                <w:rFonts w:ascii="Arial" w:hAnsi="Arial" w:eastAsia="Arial" w:cs="Arial"/>
+                <w:b w:val="0"/>
+                <w:bCs w:val="0"/>
+                <w:i w:val="1"/>
+                <w:iCs w:val="1"/>
+                <w:caps w:val="0"/>
+                <w:smallCaps w:val="0"/>
+                <w:color w:val="000000" w:themeColor="text1" w:themeTint="FF" w:themeShade="FF"/>
+                <w:sz w:val="26"/>
+                <w:szCs w:val="26"/>
+                <w:lang w:val="ca"/>
+              </w:rPr>
+              <w:t xml:space="preserve">Tutoria </w:t>
+            </w:r>
+            <w:r>
+              <w:rPr>
+                <w:rFonts w:ascii="Arial" w:hAnsi="Arial" w:eastAsia="Arial" w:cs="Arial"/>
+                <w:b w:val="0"/>
+                <w:bCs w:val="0"/>
+                <w:i w:val="0"/>
+                <w:iCs w:val="0"/>
+                <w:caps w:val="0"/>
+                <w:smallCaps w:val="0"/>
+                <w:color w:val="000000" w:themeColor="text1" w:themeTint="FF" w:themeShade="FF"/>
+                <w:sz w:val="26"/>
+                <w:szCs w:val="26"/>
+                <w:lang w:val="ca"/>
+              </w:rPr>
+              <w:t>del</w:t>
+            </w:r>
+            <w:r>
+              <w:rPr>
+                <w:rFonts w:ascii="Arial" w:hAnsi="Arial" w:eastAsia="Arial" w:cs="Arial"/>
+                <w:b w:val="0"/>
+                <w:bCs w:val="0"/>
+                <w:i w:val="1"/>
+                <w:iCs w:val="1"/>
+                <w:caps w:val="0"/>
+                <w:smallCaps w:val="0"/>
+                <w:color w:val="000000" w:themeColor="text1" w:themeTint="FF" w:themeShade="FF"/>
+                <w:sz w:val="26"/>
+                <w:szCs w:val="26"/>
+                <w:lang w:val="ca"/>
+              </w:rPr>
+              <w:t xml:space="preserve"> curs ${CursCicleGrup}</w:t>
+            </w:r>
+          </w:p>
+        </w:tc>
+      </w:tr>
+    </w:tbl>
+    <w:p>
+      <w:pPr>
+        <w:widowControl w:val="1"/>
+        <w:spacing w:before="240" w:after="240"/>
+        <w:jc w:val="both"/>
+        <w:rPr>
+          <w:rFonts w:ascii="Arial" w:hAnsi="Arial" w:eastAsia="Arial" w:cs="Arial"/>
+          <w:sz w:val="26"/>
+          <w:szCs w:val="26"/>
           <w:rtl w:val="0"/>
         </w:rPr>
-        <w:t xml:space="preserve">Atentament,</w:t>
-      </w:r>
-    </w:p>
-    <w:p xmlns:wp14="http://schemas.microsoft.com/office/word/2010/wordml" wp14:textId="7FC16D87">
-      <w:pPr>
-        <w:widowControl w:val="1"/>
-        <w:spacing w:before="240" w:after="240" w:lineRule="auto"/>
-        <w:jc w:val="both"/>
-        <w:rPr>
-          <w:rFonts w:ascii="Arial" w:hAnsi="Arial" w:eastAsia="Arial" w:cs="Arial"/>
-          <w:i w:val="1"/>
-          <w:iCs w:val="1"/>
-          <w:sz w:val="26"/>
-          <w:szCs w:val="26"/>
-          <w:rtl w:val="0"/>
-        </w:rPr>
-      </w:pPr>
-      <w:r>
-        <w:rPr>
-          <w:rFonts w:ascii="Arial" w:hAnsi="Arial" w:eastAsia="Arial" w:cs="Arial"/>
-          <w:sz w:val="26"/>
-          <w:szCs w:val="26"/>
-        </w:rPr>
-        <w:t xml:space="preserve">${</w:t>
-      </w:r>
-      <w:r>
-        <w:rPr>
-          <w:rFonts w:ascii="Arial" w:hAnsi="Arial" w:eastAsia="Arial" w:cs="Arial"/>
-          <w:sz w:val="26"/>
-          <w:szCs w:val="26"/>
-        </w:rPr>
-        <w:t xml:space="preserve">Tutor</w:t>
-      </w:r>
-      <w:r>
-        <w:rPr>
-          <w:rFonts w:ascii="Arial" w:hAnsi="Arial" w:eastAsia="Arial" w:cs="Arial"/>
-          <w:sz w:val="26"/>
-          <w:szCs w:val="26"/>
-        </w:rPr>
-        <w:t xml:space="preserve">} </w:t>
-      </w:r>
-      <w:r>
-        <w:rPr>
-          <w:rFonts w:ascii="Arial" w:hAnsi="Arial" w:eastAsia="Arial" w:cs="Arial"/>
-          <w:sz w:val="26"/>
-          <w:szCs w:val="26"/>
-          <w:rtl w:val="0"/>
-        </w:rPr>
-        <w:br w:type="textWrapping"/>
-      </w:r>
-      <w:r>
-        <w:rPr>
-          <w:rFonts w:ascii="Arial" w:hAnsi="Arial" w:eastAsia="Arial" w:cs="Arial"/>
-          <w:i w:val="1"/>
-          <w:iCs w:val="1"/>
-          <w:sz w:val="26"/>
-          <w:szCs w:val="26"/>
-        </w:rPr>
-        <w:t xml:space="preserve">Tutoria del curs </w:t>
-      </w:r>
-      <w:r>
-        <w:rPr>
-          <w:rFonts w:ascii="Arial" w:hAnsi="Arial" w:eastAsia="Arial" w:cs="Arial"/>
-          <w:i w:val="1"/>
-          <w:iCs w:val="1"/>
-          <w:sz w:val="26"/>
-          <w:szCs w:val="26"/>
-        </w:rPr>
-        <w:t xml:space="preserve">${</w:t>
-      </w:r>
-      <w:r>
-        <w:rPr>
-          <w:rFonts w:ascii="Arial" w:hAnsi="Arial" w:eastAsia="Arial" w:cs="Arial"/>
-          <w:i w:val="1"/>
-          <w:iCs w:val="1"/>
-          <w:sz w:val="26"/>
-          <w:szCs w:val="26"/>
-        </w:rPr>
-        <w:t xml:space="preserve">CursCicleGrup</w:t>
-      </w:r>
-      <w:r>
-        <w:rPr>
-          <w:rFonts w:ascii="Arial" w:hAnsi="Arial" w:eastAsia="Arial" w:cs="Arial"/>
-          <w:i w:val="1"/>
-          <w:iCs w:val="1"/>
-          <w:sz w:val="26"/>
-          <w:szCs w:val="26"/>
-        </w:rPr>
-        <w:t xml:space="preserve">}</w:t>
-      </w:r>
-    </w:p>
-    <w:p xmlns:wp14="http://schemas.microsoft.com/office/word/2010/wordml" wp14:textId="77777777">
-      <w:pPr>
-        <w:widowControl w:val="1"/>
-        <w:spacing w:before="240" w:after="240" w:lineRule="auto"/>
-        <w:jc w:val="both"/>
-        <w:rPr>
-          <w:rFonts w:ascii="Arial" w:hAnsi="Arial" w:eastAsia="Arial" w:cs="Arial"/>
-          <w:i w:val="1"/>
-          <w:iCs w:val="1"/>
-          <w:sz w:val="26"/>
-          <w:szCs w:val="26"/>
-        </w:rPr>
-      </w:pPr>
-      <w:r>
-        <w:rPr>
-          <w:rtl w:val="0"/>
-        </w:rPr>
-      </w:r>
+      </w:pPr>
     </w:p>
     <w:p xmlns:wp14="http://schemas.microsoft.com/office/word/2010/wordml" wp14:textId="4419AE98">
       <w:pPr>
@@ -1481,6 +1544,32 @@
       </w:tblCellMar>
     </w:tblPr>
   </w:style>
+  <w:style xmlns:w="http://schemas.openxmlformats.org/wordprocessingml/2006/main" w:type="table" w:styleId="TableGrid">
+    <w:name xmlns:w="http://schemas.openxmlformats.org/wordprocessingml/2006/main" w:val="Table Grid"/>
+    <w:basedOn xmlns:w="http://schemas.openxmlformats.org/wordprocessingml/2006/main" w:val="TableNormal"/>
+    <w:uiPriority xmlns:w="http://schemas.openxmlformats.org/wordprocessingml/2006/main" w:val="59"/>
+    <w:rsid xmlns:w="http://schemas.openxmlformats.org/wordprocessingml/2006/main" w:val="00FB4123"/>
+    <w:pPr xmlns:w="http://schemas.openxmlformats.org/wordprocessingml/2006/main">
+      <w:spacing w:after="0" w:line="240" w:lineRule="auto"/>
+    </w:pPr>
+    <w:tblPr xmlns:w="http://schemas.openxmlformats.org/wordprocessingml/2006/main">
+      <w:tblInd w:w="0" w:type="dxa"/>
+      <w:tblBorders>
+        <w:top w:val="single" w:color="000000" w:themeColor="text1" w:sz="4" w:space="0"/>
+        <w:left w:val="single" w:color="000000" w:themeColor="text1" w:sz="4" w:space="0"/>
+        <w:bottom w:val="single" w:color="000000" w:themeColor="text1" w:sz="4" w:space="0"/>
+        <w:right w:val="single" w:color="000000" w:themeColor="text1" w:sz="4" w:space="0"/>
+        <w:insideH w:val="single" w:color="000000" w:themeColor="text1" w:sz="4" w:space="0"/>
+        <w:insideV w:val="single" w:color="000000" w:themeColor="text1" w:sz="4" w:space="0"/>
+      </w:tblBorders>
+      <w:tblCellMar>
+        <w:top w:w="0" w:type="dxa"/>
+        <w:left w:w="108" w:type="dxa"/>
+        <w:bottom w:w="0" w:type="dxa"/>
+        <w:right w:w="108" w:type="dxa"/>
+      </w:tblCellMar>
+    </w:tblPr>
+  </w:style>
 </w:styles>
 </file>
 

</xml_diff>